<commit_message>
updated ER diagram + put user stories in. filled out contribution form. fixed stale reputation/credibility in DB. fixed dynamic routing browser refresh error in [id].tsx,
</commit_message>
<xml_diff>
--- a/COSC2758_2938_Assignment2_GroupContributionForm.docx
+++ b/COSC2758_2938_Assignment2_GroupContributionForm.docx
@@ -556,7 +556,11 @@
             <w:cnfStyle w:val="001000000000" w:firstRow="0" w:lastRow="0" w:firstColumn="1" w:lastColumn="0" w:oddVBand="0" w:evenVBand="0" w:oddHBand="0" w:evenHBand="0" w:firstRowFirstColumn="0" w:firstRowLastColumn="0" w:lastRowFirstColumn="0" w:lastRowLastColumn="0"/>
             <w:tcW w:w="927" w:type="pct"/>
           </w:tcPr>
-          <w:p/>
+          <w:p>
+            <w:r>
+              <w:t>S4164413</w:t>
+            </w:r>
+          </w:p>
         </w:tc>
         <w:tc>
           <w:tcPr>
@@ -569,6 +573,9 @@
             <w:pPr>
               <w:cnfStyle w:val="000000000000" w:firstRow="0" w:lastRow="0" w:firstColumn="0" w:lastColumn="0" w:oddVBand="0" w:evenVBand="0" w:oddHBand="0" w:evenHBand="0" w:firstRowFirstColumn="0" w:firstRowLastColumn="0" w:lastRowFirstColumn="0" w:lastRowLastColumn="0"/>
             </w:pPr>
+            <w:r>
+              <w:t>Ananya Venkatesh Babu</w:t>
+            </w:r>
           </w:p>
         </w:tc>
         <w:tc>
@@ -600,6 +607,9 @@
               <w:pStyle w:val="Price"/>
               <w:cnfStyle w:val="000000000000" w:firstRow="0" w:lastRow="0" w:firstColumn="0" w:lastColumn="0" w:oddVBand="0" w:evenVBand="0" w:oddHBand="0" w:evenHBand="0" w:firstRowFirstColumn="0" w:firstRowLastColumn="0" w:lastRowFirstColumn="0" w:lastRowLastColumn="0"/>
             </w:pPr>
+            <w:r>
+              <w:t>50</w:t>
+            </w:r>
           </w:p>
         </w:tc>
       </w:tr>
@@ -612,7 +622,11 @@
             <w:cnfStyle w:val="001000000000" w:firstRow="0" w:lastRow="0" w:firstColumn="1" w:lastColumn="0" w:oddVBand="0" w:evenVBand="0" w:oddHBand="0" w:evenHBand="0" w:firstRowFirstColumn="0" w:firstRowLastColumn="0" w:lastRowFirstColumn="0" w:lastRowLastColumn="0"/>
             <w:tcW w:w="927" w:type="pct"/>
           </w:tcPr>
-          <w:p/>
+          <w:p>
+            <w:r>
+              <w:t>S4164624</w:t>
+            </w:r>
+          </w:p>
         </w:tc>
         <w:tc>
           <w:tcPr>
@@ -625,6 +639,9 @@
             <w:pPr>
               <w:cnfStyle w:val="000000000000" w:firstRow="0" w:lastRow="0" w:firstColumn="0" w:lastColumn="0" w:oddVBand="0" w:evenVBand="0" w:oddHBand="0" w:evenHBand="0" w:firstRowFirstColumn="0" w:firstRowLastColumn="0" w:lastRowFirstColumn="0" w:lastRowLastColumn="0"/>
             </w:pPr>
+            <w:r>
+              <w:t>Hannah Alyssa Pham</w:t>
+            </w:r>
           </w:p>
         </w:tc>
         <w:tc>
@@ -656,6 +673,9 @@
               <w:pStyle w:val="Price"/>
               <w:cnfStyle w:val="000000000000" w:firstRow="0" w:lastRow="0" w:firstColumn="0" w:lastColumn="0" w:oddVBand="0" w:evenVBand="0" w:oddHBand="0" w:evenHBand="0" w:firstRowFirstColumn="0" w:firstRowLastColumn="0" w:lastRowFirstColumn="0" w:lastRowLastColumn="0"/>
             </w:pPr>
+            <w:r>
+              <w:t>50</w:t>
+            </w:r>
           </w:p>
         </w:tc>
       </w:tr>
@@ -725,7 +745,10 @@
         <w:spacing w:after="0"/>
       </w:pPr>
       <w:r>
-        <w:t>Student 1: ____________________________________________________________</w:t>
+        <w:t xml:space="preserve">Student 1: </w:t>
+      </w:r>
+      <w:r>
+        <w:t>Ananya Venkatesh Babu</w:t>
       </w:r>
     </w:p>
     <w:p>
@@ -743,7 +766,10 @@
         <w:spacing w:after="0"/>
       </w:pPr>
       <w:r>
-        <w:t>Student 2: ____________________________________________________________</w:t>
+        <w:t xml:space="preserve">Student 2: </w:t>
+      </w:r>
+      <w:r>
+        <w:t>Hannah Alyssa Pham</w:t>
       </w:r>
     </w:p>
     <w:sectPr>
@@ -1845,7 +1871,6 @@
 <file path=word/glossary/fontTable.xml><?xml version="1.0" encoding="utf-8"?>
 <w:fonts xmlns:mc="http://schemas.openxmlformats.org/markup-compatibility/2006" xmlns:r="http://schemas.openxmlformats.org/officeDocument/2006/relationships" xmlns:w="http://schemas.openxmlformats.org/wordprocessingml/2006/main" xmlns:w14="http://schemas.microsoft.com/office/word/2010/wordml" xmlns:w15="http://schemas.microsoft.com/office/word/2012/wordml" xmlns:w16cex="http://schemas.microsoft.com/office/word/2018/wordml/cex" xmlns:w16cid="http://schemas.microsoft.com/office/word/2016/wordml/cid" xmlns:w16="http://schemas.microsoft.com/office/word/2018/wordml" xmlns:w16du="http://schemas.microsoft.com/office/word/2023/wordml/word16du" xmlns:w16sdtdh="http://schemas.microsoft.com/office/word/2020/wordml/sdtdatahash" xmlns:w16sdtfl="http://schemas.microsoft.com/office/word/2024/wordml/sdtformatlock" xmlns:w16se="http://schemas.microsoft.com/office/word/2015/wordml/symex" mc:Ignorable="w14 w15 w16se w16cid w16 w16cex w16sdtdh w16sdtfl w16du">
   <w:font w:name="Aptos">
-    <w:panose1 w:val="020B0004020202020204"/>
     <w:charset w:val="00"/>
     <w:family w:val="swiss"/>
     <w:pitch w:val="variable"/>
@@ -1859,7 +1884,6 @@
     <w:sig w:usb0="E0002EFF" w:usb1="C000785B" w:usb2="00000009" w:usb3="00000000" w:csb0="000001FF" w:csb1="00000000"/>
   </w:font>
   <w:font w:name="Aptos Display">
-    <w:panose1 w:val="020B0004020202020204"/>
     <w:charset w:val="00"/>
     <w:family w:val="swiss"/>
     <w:pitch w:val="variable"/>
@@ -1875,7 +1899,6 @@
   </w:font>
   <w:font w:name="Times New Roman (Body CS)">
     <w:altName w:val="Times New Roman"/>
-    <w:panose1 w:val="020B0604020202020204"/>
     <w:charset w:val="00"/>
     <w:family w:val="roman"/>
     <w:pitch w:val="default"/>
@@ -1901,10 +1924,12 @@
     <w:rsidRoot w:val="00294A3F"/>
     <w:rsid w:val="00004C2B"/>
     <w:rsid w:val="000755D9"/>
+    <w:rsid w:val="000D5F35"/>
     <w:rsid w:val="002870B8"/>
     <w:rsid w:val="00294A3F"/>
     <w:rsid w:val="006050AE"/>
     <w:rsid w:val="008E5D12"/>
+    <w:rsid w:val="0099246F"/>
     <w:rsid w:val="00A250B2"/>
     <w:rsid w:val="00A64A01"/>
     <w:rsid w:val="00AB47C8"/>
@@ -2696,4 +2721,10 @@
     </a:ext>
   </a:extLst>
 </a:theme>
+</file>
+
+<file path=docMetadata/LabelInfo.xml><?xml version="1.0" encoding="utf-8"?>
+<clbl:labelList xmlns:clbl="http://schemas.microsoft.com/office/2020/mipLabelMetadata">
+  <clbl:label id="{ddaa77bc-0157-46a4-82a6-8fc765694bc9}" enabled="1" method="Standard" siteId="{d1323671-cdbe-4417-b4d4-bdb24b51316b}" contentBits="0" removed="0"/>
+</clbl:labelList>
 </file>
</xml_diff>